<commit_message>
Refine white-label ATA terminology
</commit_message>
<xml_diff>
--- a/modules/atas/data/templates/ata_reuniao_generica.docx
+++ b/modules/atas/data/templates/ata_reuniao_generica.docx
@@ -81,106 +81,6 @@
     </w:p>
     <w:p>
       <w:r>
-        <w:t>{% if tr_presidencia %}</w:t>
-      </w:r>
-    </w:p>
-    <w:p>
-      <w:r>
-        <w:t>Presidencia</w:t>
-      </w:r>
-    </w:p>
-    <w:p>
-      <w:r>
-        <w:t>Realizadas: {{ tr_presidencia_realizadas }}</w:t>
-      </w:r>
-    </w:p>
-    <w:p>
-      <w:r>
-        <w:t>Planejadas: {{ tr_presidencia_planejadas }}</w:t>
-      </w:r>
-    </w:p>
-    <w:p>
-      <w:r>
-        <w:t>{% endif %}</w:t>
-      </w:r>
-    </w:p>
-    <w:p>
-      <w:r>
-        <w:t>{% if tr_vice_presidencia %}</w:t>
-      </w:r>
-    </w:p>
-    <w:p>
-      <w:r>
-        <w:t>Vice Presidencia</w:t>
-      </w:r>
-    </w:p>
-    <w:p>
-      <w:r>
-        <w:t>Realizadas: {{ tr_vice_presidencia_realizadas }}</w:t>
-      </w:r>
-    </w:p>
-    <w:p>
-      <w:r>
-        <w:t>Planejadas: {{ tr_vice_presidencia_planejadas }}</w:t>
-      </w:r>
-    </w:p>
-    <w:p>
-      <w:r>
-        <w:t>{% endif %}</w:t>
-      </w:r>
-    </w:p>
-    <w:p>
-      <w:r>
-        <w:t>{% if tr_juridico_financeiro %}</w:t>
-      </w:r>
-    </w:p>
-    <w:p>
-      <w:r>
-        <w:t>Juridico Financeiro</w:t>
-      </w:r>
-    </w:p>
-    <w:p>
-      <w:r>
-        <w:t>Realizadas: {{ tr_juridico_financeiro_realizadas }}</w:t>
-      </w:r>
-    </w:p>
-    <w:p>
-      <w:r>
-        <w:t>Planejadas: {{ tr_juridico_financeiro_planejadas }}</w:t>
-      </w:r>
-    </w:p>
-    <w:p>
-      <w:r>
-        <w:t>{% endif %}</w:t>
-      </w:r>
-    </w:p>
-    <w:p>
-      <w:r>
-        <w:t>{% if tr_gestao_de_pessoas %}</w:t>
-      </w:r>
-    </w:p>
-    <w:p>
-      <w:r>
-        <w:t>Gestao De Pessoas</w:t>
-      </w:r>
-    </w:p>
-    <w:p>
-      <w:r>
-        <w:t>Realizadas: {{ tr_gestao_de_pessoas_realizadas }}</w:t>
-      </w:r>
-    </w:p>
-    <w:p>
-      <w:r>
-        <w:t>Planejadas: {{ tr_gestao_de_pessoas_planejadas }}</w:t>
-      </w:r>
-    </w:p>
-    <w:p>
-      <w:r>
-        <w:t>{% endif %}</w:t>
-      </w:r>
-    </w:p>
-    <w:p>
-      <w:r>
         <w:t>{% if tr_projetos %}</w:t>
       </w:r>
     </w:p>
@@ -231,22 +131,147 @@
     </w:p>
     <w:p>
       <w:r>
-        <w:t>{% if tr_comercial %}</w:t>
+        <w:t>{% if tr_negocios %}</w:t>
       </w:r>
     </w:p>
     <w:p>
       <w:r>
-        <w:t>Comercial</w:t>
+        <w:t>Negocios</w:t>
       </w:r>
     </w:p>
     <w:p>
       <w:r>
-        <w:t>Realizadas: {{ tr_comercial_realizadas }}</w:t>
+        <w:t>Realizadas: {{ tr_negocios_realizadas }}</w:t>
       </w:r>
     </w:p>
     <w:p>
       <w:r>
-        <w:t>Planejadas: {{ tr_comercial_planejadas }}</w:t>
+        <w:t>Planejadas: {{ tr_negocios_planejadas }}</w:t>
+      </w:r>
+    </w:p>
+    <w:p>
+      <w:r>
+        <w:t>{% endif %}</w:t>
+      </w:r>
+    </w:p>
+    <w:p>
+      <w:r>
+        <w:t>{% if tr_jf %}</w:t>
+      </w:r>
+    </w:p>
+    <w:p>
+      <w:r>
+        <w:t>Juridico-Financeiro</w:t>
+      </w:r>
+    </w:p>
+    <w:p>
+      <w:r>
+        <w:t>Realizadas: {{ tr_jf_realizadas }}</w:t>
+      </w:r>
+    </w:p>
+    <w:p>
+      <w:r>
+        <w:t>Planejadas: {{ tr_jf_planejadas }}</w:t>
+      </w:r>
+    </w:p>
+    <w:p>
+      <w:r>
+        <w:t>{% endif %}</w:t>
+      </w:r>
+    </w:p>
+    <w:p>
+      <w:r>
+        <w:t>{% if tr_parcerias %}</w:t>
+      </w:r>
+    </w:p>
+    <w:p>
+      <w:r>
+        <w:t>Parcerias</w:t>
+      </w:r>
+    </w:p>
+    <w:p>
+      <w:r>
+        <w:t>Realizadas: {{ tr_parcerias_realizadas }}</w:t>
+      </w:r>
+    </w:p>
+    <w:p>
+      <w:r>
+        <w:t>Planejadas: {{ tr_parcerias_planejadas }}</w:t>
+      </w:r>
+    </w:p>
+    <w:p>
+      <w:r>
+        <w:t>{% endif %}</w:t>
+      </w:r>
+    </w:p>
+    <w:p>
+      <w:r>
+        <w:t>{% if tr_gp %}</w:t>
+      </w:r>
+    </w:p>
+    <w:p>
+      <w:r>
+        <w:t>Gestao de Pessoas</w:t>
+      </w:r>
+    </w:p>
+    <w:p>
+      <w:r>
+        <w:t>Realizadas: {{ tr_gp_realizadas }}</w:t>
+      </w:r>
+    </w:p>
+    <w:p>
+      <w:r>
+        <w:t>Planejadas: {{ tr_gp_planejadas }}</w:t>
+      </w:r>
+    </w:p>
+    <w:p>
+      <w:r>
+        <w:t>{% endif %}</w:t>
+      </w:r>
+    </w:p>
+    <w:p>
+      <w:r>
+        <w:t>{% if tr_qualidade %}</w:t>
+      </w:r>
+    </w:p>
+    <w:p>
+      <w:r>
+        <w:t>Qualidade</w:t>
+      </w:r>
+    </w:p>
+    <w:p>
+      <w:r>
+        <w:t>Realizadas: {{ tr_qualidade_realizadas }}</w:t>
+      </w:r>
+    </w:p>
+    <w:p>
+      <w:r>
+        <w:t>Planejadas: {{ tr_qualidade_planejadas }}</w:t>
+      </w:r>
+    </w:p>
+    <w:p>
+      <w:r>
+        <w:t>{% endif %}</w:t>
+      </w:r>
+    </w:p>
+    <w:p>
+      <w:r>
+        <w:t>{% if tr_direx %}</w:t>
+      </w:r>
+    </w:p>
+    <w:p>
+      <w:r>
+        <w:t>Diretoria Executiva</w:t>
+      </w:r>
+    </w:p>
+    <w:p>
+      <w:r>
+        <w:t>Realizadas: {{ tr_direx_realizadas }}</w:t>
+      </w:r>
+    </w:p>
+    <w:p>
+      <w:r>
+        <w:t>Planejadas: {{ tr_direx_planejadas }}</w:t>
       </w:r>
     </w:p>
     <w:p>
@@ -259,17 +284,35 @@
         <w:pStyle w:val="Heading1"/>
       </w:pPr>
       <w:r>
-        <w:t>Encerramento</w:t>
+        <w:t>Reconhecimento Interno</w:t>
       </w:r>
     </w:p>
     <w:p>
       <w:r>
-        <w:t>{% if texto_sparckselt %}Reconhecimentos: {{ s.novo }}{% endif %}</w:t>
+        <w:t>{% if tem_reconhecimento %}Responsavel anterior: {{ reconhecimento.anterior }}{% endif %}</w:t>
       </w:r>
     </w:p>
     <w:p>
       <w:r>
-        <w:t>{% if texto_elogios %}Elogios do leitor: {{ ce.nomes }}{% endif %}</w:t>
+        <w:t>{% if tem_reconhecimento %}Novo reconhecimento: {{ reconhecimento.novo }}{% endif %}</w:t>
+      </w:r>
+    </w:p>
+    <w:p>
+      <w:r>
+        <w:t>{% if tem_reconhecimento %}Motivo: {{ reconhecimento.motivo }}{% endif %}</w:t>
+      </w:r>
+    </w:p>
+    <w:p>
+      <w:pPr>
+        <w:pStyle w:val="Heading1"/>
+      </w:pPr>
+      <w:r>
+        <w:t>Mensagens de Reconhecimento</w:t>
+      </w:r>
+    </w:p>
+    <w:p>
+      <w:r>
+        <w:t>{% if tem_mensagens_reconhecimento %}Responsavel pela leitura: {{ mensagens_reconhecimento.nomes }}{% endif %}</w:t>
       </w:r>
     </w:p>
     <w:sectPr>

</xml_diff>

<commit_message>
Add configurable ATA directorates and fork guide
</commit_message>
<xml_diff>
--- a/modules/atas/data/templates/ata_reuniao_generica.docx
+++ b/modules/atas/data/templates/ata_reuniao_generica.docx
@@ -81,202 +81,27 @@
     </w:p>
     <w:p>
       <w:r>
-        <w:t>{% if tr_projetos %}</w:t>
+        <w:t>{% for item in lista_transparencias %}</w:t>
       </w:r>
     </w:p>
     <w:p>
       <w:r>
-        <w:t>Projetos</w:t>
+        <w:t>{{ item.nome }}</w:t>
       </w:r>
     </w:p>
     <w:p>
       <w:r>
-        <w:t>Realizadas: {{ tr_projetos_realizadas }}</w:t>
+        <w:t>Realizadas: {{ item.realizadas }}</w:t>
       </w:r>
     </w:p>
     <w:p>
       <w:r>
-        <w:t>Planejadas: {{ tr_projetos_planejadas }}</w:t>
+        <w:t>Planejadas: {{ item.planejadas }}</w:t>
       </w:r>
     </w:p>
     <w:p>
       <w:r>
-        <w:t>{% endif %}</w:t>
-      </w:r>
-    </w:p>
-    <w:p>
-      <w:r>
-        <w:t>{% if tr_marketing %}</w:t>
-      </w:r>
-    </w:p>
-    <w:p>
-      <w:r>
-        <w:t>Marketing</w:t>
-      </w:r>
-    </w:p>
-    <w:p>
-      <w:r>
-        <w:t>Realizadas: {{ tr_marketing_realizadas }}</w:t>
-      </w:r>
-    </w:p>
-    <w:p>
-      <w:r>
-        <w:t>Planejadas: {{ tr_marketing_planejadas }}</w:t>
-      </w:r>
-    </w:p>
-    <w:p>
-      <w:r>
-        <w:t>{% endif %}</w:t>
-      </w:r>
-    </w:p>
-    <w:p>
-      <w:r>
-        <w:t>{% if tr_negocios %}</w:t>
-      </w:r>
-    </w:p>
-    <w:p>
-      <w:r>
-        <w:t>Negocios</w:t>
-      </w:r>
-    </w:p>
-    <w:p>
-      <w:r>
-        <w:t>Realizadas: {{ tr_negocios_realizadas }}</w:t>
-      </w:r>
-    </w:p>
-    <w:p>
-      <w:r>
-        <w:t>Planejadas: {{ tr_negocios_planejadas }}</w:t>
-      </w:r>
-    </w:p>
-    <w:p>
-      <w:r>
-        <w:t>{% endif %}</w:t>
-      </w:r>
-    </w:p>
-    <w:p>
-      <w:r>
-        <w:t>{% if tr_jf %}</w:t>
-      </w:r>
-    </w:p>
-    <w:p>
-      <w:r>
-        <w:t>Juridico-Financeiro</w:t>
-      </w:r>
-    </w:p>
-    <w:p>
-      <w:r>
-        <w:t>Realizadas: {{ tr_jf_realizadas }}</w:t>
-      </w:r>
-    </w:p>
-    <w:p>
-      <w:r>
-        <w:t>Planejadas: {{ tr_jf_planejadas }}</w:t>
-      </w:r>
-    </w:p>
-    <w:p>
-      <w:r>
-        <w:t>{% endif %}</w:t>
-      </w:r>
-    </w:p>
-    <w:p>
-      <w:r>
-        <w:t>{% if tr_parcerias %}</w:t>
-      </w:r>
-    </w:p>
-    <w:p>
-      <w:r>
-        <w:t>Parcerias</w:t>
-      </w:r>
-    </w:p>
-    <w:p>
-      <w:r>
-        <w:t>Realizadas: {{ tr_parcerias_realizadas }}</w:t>
-      </w:r>
-    </w:p>
-    <w:p>
-      <w:r>
-        <w:t>Planejadas: {{ tr_parcerias_planejadas }}</w:t>
-      </w:r>
-    </w:p>
-    <w:p>
-      <w:r>
-        <w:t>{% endif %}</w:t>
-      </w:r>
-    </w:p>
-    <w:p>
-      <w:r>
-        <w:t>{% if tr_gp %}</w:t>
-      </w:r>
-    </w:p>
-    <w:p>
-      <w:r>
-        <w:t>Gestao de Pessoas</w:t>
-      </w:r>
-    </w:p>
-    <w:p>
-      <w:r>
-        <w:t>Realizadas: {{ tr_gp_realizadas }}</w:t>
-      </w:r>
-    </w:p>
-    <w:p>
-      <w:r>
-        <w:t>Planejadas: {{ tr_gp_planejadas }}</w:t>
-      </w:r>
-    </w:p>
-    <w:p>
-      <w:r>
-        <w:t>{% endif %}</w:t>
-      </w:r>
-    </w:p>
-    <w:p>
-      <w:r>
-        <w:t>{% if tr_qualidade %}</w:t>
-      </w:r>
-    </w:p>
-    <w:p>
-      <w:r>
-        <w:t>Qualidade</w:t>
-      </w:r>
-    </w:p>
-    <w:p>
-      <w:r>
-        <w:t>Realizadas: {{ tr_qualidade_realizadas }}</w:t>
-      </w:r>
-    </w:p>
-    <w:p>
-      <w:r>
-        <w:t>Planejadas: {{ tr_qualidade_planejadas }}</w:t>
-      </w:r>
-    </w:p>
-    <w:p>
-      <w:r>
-        <w:t>{% endif %}</w:t>
-      </w:r>
-    </w:p>
-    <w:p>
-      <w:r>
-        <w:t>{% if tr_direx %}</w:t>
-      </w:r>
-    </w:p>
-    <w:p>
-      <w:r>
-        <w:t>Diretoria Executiva</w:t>
-      </w:r>
-    </w:p>
-    <w:p>
-      <w:r>
-        <w:t>Realizadas: {{ tr_direx_realizadas }}</w:t>
-      </w:r>
-    </w:p>
-    <w:p>
-      <w:r>
-        <w:t>Planejadas: {{ tr_direx_planejadas }}</w:t>
-      </w:r>
-    </w:p>
-    <w:p>
-      <w:r>
-        <w:t>{% endif %}</w:t>
+        <w:t>{% endfor %}</w:t>
       </w:r>
     </w:p>
     <w:p>

</xml_diff>